<commit_message>
Docs: manual de uso v1.3 con la seccion del asistente por chat y referencia del manual en la v2.2
</commit_message>
<xml_diff>
--- a/Manual_de_Uso_Requintu.docx
+++ b/Manual_de_Uso_Requintu.docx
@@ -67,7 +67,7 @@
         <w:jc w:val="center"/>
       </w:pPr>
       <w:r>
-        <w:t xml:space="preserve">Versión 1.2 — 18 de septiembre de 2026</w:t>
+        <w:t xml:space="preserve">Versión 1.3 — 18 de septiembre de 2026</w:t>
       </w:r>
     </w:p>
     <w:p>
@@ -762,6 +762,39 @@
           <w:szCs w:val="22"/>
         </w:rPr>
         <w:t xml:space="preserve">Avisos en tiempo real: mientras estás en el muro, si otra persona publica aparecerá al pie el aviso "Hay N publicaciones nuevas en el muro"; pulsa "Ver ahora" para mostrar las novedades sin recargar la página. Si otro usuario edita o elimina una publicación, el muro se actualiza solo.</w:t>
+      </w:r>
+    </w:p>
+    <w:p>
+      <w:pPr>
+        <w:pStyle w:val="Heading2"/>
+        <w:spacing w:after="100" w:before="200"/>
+      </w:pPr>
+      <w:r>
+        <w:t xml:space="preserve">5.6 Asistente por chat</w:t>
+      </w:r>
+    </w:p>
+    <w:p>
+      <w:pPr>
+        <w:spacing w:after="120"/>
+      </w:pPr>
+      <w:r>
+        <w:rPr>
+          <w:sz w:val="22"/>
+          <w:szCs w:val="22"/>
+        </w:rPr>
+        <w:t xml:space="preserve">En la esquina inferior derecha de la pantalla está el botón del asistente de Requintu. Ábrelo y escribe en lenguaje natural, por ejemplo: "recomiéndame los mejores restaurantes", "qué me recomiendas en Bucaramanga" o "sitios destacados". El asistente interpreta la ciudad, el departamento o la categoría que mencionas y responde con los locales recomendados: los destacados (con la insignia «Oficial») aparecen primero, junto con su calificación de estrellas y un enlace a la ficha de cada uno. Si no sabes qué preguntar, pulsa cualquiera de los mensajes sugeridos que el asistente te ofrece.</w:t>
+      </w:r>
+    </w:p>
+    <w:p>
+      <w:pPr>
+        <w:spacing w:after="120"/>
+      </w:pPr>
+      <w:r>
+        <w:rPr>
+          <w:sz w:val="22"/>
+          <w:szCs w:val="22"/>
+        </w:rPr>
+        <w:t xml:space="preserve">También responde a saludos y agradecimientos, y sigue el idioma de la aplicación: si la plataforma está en inglés, el asistente responde en inglés.</w:t>
       </w:r>
     </w:p>
     <w:p>
@@ -1833,7 +1866,7 @@
         <w:sz w:val="16"/>
         <w:szCs w:val="16"/>
       </w:rPr>
-      <w:t xml:space="preserve">Manual de Uso Requintu v1.2  |  Página </w:t>
+      <w:t xml:space="preserve">Manual de Uso Requintu v1.3  |  Página </w:t>
     </w:r>
     <w:r>
       <w:rPr>

</xml_diff>